<commit_message>
goitn for rmove hardcoded
</commit_message>
<xml_diff>
--- a/backend/outputs/generated_affidavit.docx
+++ b/backend/outputs/generated_affidavit.docx
@@ -25,7 +25,7 @@
           <w:b/>
           <w:sz w:val="24"/>
         </w:rPr>
-        <w:t>ORDINARY ORIGINAL CIVIL JURISDICTION</w:t>
+        <w:t>CIVIL APPELLATE JURISDICTION</w:t>
       </w:r>
     </w:p>
     <w:p>
@@ -38,7 +38,7 @@
           <w:b/>
           <w:sz w:val="24"/>
         </w:rPr>
-        <w:t>WRIT PETITION NO. 1847 OF 2026</w:t>
+        <w:t>WRIT PETITION NO. 2491 OF 2026</w:t>
       </w:r>
     </w:p>
     <w:p>
@@ -50,9 +50,9 @@
         <w:rPr>
           <w:sz w:val="24"/>
         </w:rPr>
-        <w:t>Mr. Ramesh Vitthal Ghadge, Age 52 years, Occupation: Retired Bank Employee,</w:t>
+        <w:t>M/s. Shreeniwas Infrastructure Pvt. Ltd., a company incorporated under the Companies Act, 2013, having its registered office at 3rd Floor, Corporate Heights, Andheri-Kurla Road, Andheri (East), Mumbai - 400 059</w:t>
         <w:br/>
-        <w:t>residing at Flat No. 12, Sai Krupa Apartments, Tilak Road, Dadar (East), Mumbai - 400 014..</w:t>
+        <w:t>Through Director, Mr. Ajit Prakash Naik.</w:t>
       </w:r>
     </w:p>
     <w:p>
@@ -90,9 +90,11 @@
         <w:rPr>
           <w:sz w:val="24"/>
         </w:rPr>
-        <w:t>1. State of Maharashtra,</w:t>
+        <w:t>1. Maharashtra Industrial Development Corporation (MIDC),</w:t>
         <w:br/>
-        <w:t xml:space="preserve">   Through Secretary, Housing Department, Mantralaya, Mumbai - 400 032..</w:t>
+        <w:t xml:space="preserve">   Through Chief Executive Officer,</w:t>
+        <w:br/>
+        <w:t xml:space="preserve">   having office at MIDC Bhavan, Mahakali Caves Road, Andheri (East), Mumbai - 400 093.</w:t>
       </w:r>
     </w:p>
     <w:p>
@@ -117,9 +119,9 @@
         <w:rPr>
           <w:sz w:val="24"/>
         </w:rPr>
-        <w:t>2. Mrs. Kalpana Suresh Bhosale, Age 58 years, Occupation: Business,</w:t>
+        <w:t>2. The Executive Engineer, MIDC, Taloja Sub-Division, Taloja Industrial Area, Navi Mumbai - 410 208,</w:t>
         <w:br/>
-        <w:t xml:space="preserve">   Shop No. 4, Bhosale Chambers, Ranade Road, Dadar (West), Mumbai - 400 028..</w:t>
+        <w:t xml:space="preserve">   residing at Taloja Sub-Division, Taloja Industrial Area, Navi Mumbai - 410 208.</w:t>
       </w:r>
     </w:p>
     <w:p>
@@ -157,7 +159,7 @@
         <w:rPr>
           <w:sz w:val="24"/>
         </w:rPr>
-        <w:t>I, Mrs. Kalpana Suresh Bhosale, Age 58 years, Occupation: Business (Proprietor, Bhosale General Stores), residing at Shop No. 4, Bhosale Chambers, Ranade Road, Dadar (West), Mumbai - 400 028., the Respondent No.2 above named, do hereby solemnly affirm and state as under:</w:t>
+        <w:t>I, Mr. Suhas Balkrishna Kulkarni, having office at MIDC Sub-Divisional Office, Taloja Industrial Area, Plot No. TTC-14, Navi Mumbai - 410 208, the Executive Engineer, Taloja Sub-Division of the Respondent No.2 above named, do hereby solemnly affirm and state as under:</w:t>
       </w:r>
     </w:p>
     <w:p>
@@ -176,7 +178,7 @@
         <w:rPr>
           <w:sz w:val="24"/>
         </w:rPr>
-        <w:t>I say that I am the Respondent No.2 in the above WRIT PETITION and am well acquainted with the facts and circumstances of the case. I have perused the Petition and the documents annexed thereto and am competent to affirm this Affidavit in Reply.</w:t>
+        <w:t>I say that I am the Executive Engineer of the Taloja Sub-Division of Respondent No. 1 - MIDC, and by virtue of my position, I am duly authorised and well conversant with the facts of the present case to swear this Affidavit in Reply on behalf of Respondent No. 2. I have read the contents of the Writ Petition and reply thereto as under.</w:t>
       </w:r>
     </w:p>
     <w:p>
@@ -195,7 +197,7 @@
         <w:rPr>
           <w:sz w:val="24"/>
         </w:rPr>
-        <w:t>At the outset, I deny each and every allegation, contention and submission made in the WRIT PETITION, save and except those specifically admitted herein. I say that the Petition is misconceived, devoid of merits and is liable to be dismissed in limine.</w:t>
+        <w:t>I say that save and except what is expressly admitted in the succeeding paragraphs, all allegations, averments, and submissions made in the Petition are denied as if set out herein seriatim and specifically traversed.</w:t>
       </w:r>
     </w:p>
     <w:p>
@@ -214,7 +216,7 @@
         <w:rPr>
           <w:sz w:val="24"/>
         </w:rPr>
-        <w:t>I say that I say that the present Petition is misconceived, premature, and not maintainable in law inasmuch as the Petitioner has an efficacious alternate remedy available under Section 41 of the Presidency Small Cause Courts Act, and has deliberately bypassed the said remedy to invoke the extraordinary jurisdiction of this Hon'ble Court. The action complained of has been taken strictly in accordance with law and after following due procedure. No legal, constitutional or fundamental right of the Petitioner has been infringed.</w:t>
+        <w:t>I say that the Petition, as framed, is not maintainable and is liable to be dismissed at the threshold, as it seeks to invoke the writ jurisdiction of this Hon'ble Court to adjudicate upon disputed questions of fact arising out of a contractual arrangement, for which an efficacious remedy by way of arbitration exists under Clause 28 of the Plot Allotment Agreement dated 9th June 2019.</w:t>
       </w:r>
     </w:p>
     <w:p>
@@ -233,7 +235,7 @@
         <w:rPr>
           <w:sz w:val="24"/>
         </w:rPr>
-        <w:t>With reference to the averments made in the Petition, I say that the same are false, incorrect and denied. I say that the Petitioner's claim of adverse possession over the suit premises is factually incorrect. The suit premises were let out to the Petitioner's predecessor-in-title on a monthly tenancy basis vide a Leave and License Agreement dated 4th March 2009, and the Petitioner has continued in occupation solely on that basis, without acquiring any independent right, title, or interest. The Petitioner has failed to make out any case warranting interference in the extraordinary writ jurisdiction of this Hon'ble Court.</w:t>
+        <w:t>I say that the allegation that the Respondent Corporation has illegally terminated the plot allotment is factually incorrect. The termination was effected strictly in accordance with Clause 14(3) of the Plot Allotment Agreement, on account of the Petitioner's continued failure to commence construction within the stipulated period of 24 months despite three separate show-cause notices dated 5th July 2023, 19th December 2023, and 2nd April 2024.</w:t>
       </w:r>
     </w:p>
     <w:p>
@@ -252,7 +254,7 @@
         <w:rPr>
           <w:sz w:val="24"/>
         </w:rPr>
-        <w:t>With reference to the averments made in the Petition, I say that the same are false, incorrect and denied. I say that the Petitioner has suppressed material facts from this Hon'ble Court, including the issuance of a legal notice dated 11th January 2025 calling upon the Petitioner to vacate the suit premises on account of persistent default in payment of license fees for a period exceeding eleven months. The Petitioner has failed to make out any case warranting interference in the extraordinary writ jurisdiction of this Hon'ble Court.</w:t>
+        <w:t>I say that contrary to the Petitioner's contention, no personal hearing was required to be granted prior to termination, as the Petitioner was afforded adequate opportunity to respond to each show-cause notice and failed to furnish any satisfactory explanation for the continued non-utilisation of the allotted plot admeasuring 4,500 sq. mtrs.</w:t>
       </w:r>
     </w:p>
     <w:p>
@@ -271,7 +273,7 @@
         <w:rPr>
           <w:sz w:val="24"/>
         </w:rPr>
-        <w:t>I crave leave to refer to and rely upon the Leave and License Agreement dated 4th March 2009, annexed hereto and marked as EXHIBIT-'A', which evidences the true nature of the Petitioner's occupation of the suit premises Hereto annexed and marked as EXHIBIT-'A' is a copy of the Leave and License Agreement dated 4th March 2009.</w:t>
+        <w:t>I crave leave to refer to and rely upon the Termination Order bearing reference No. MIDC/TLJ/2024/0347 dated 18th April 2024, annexed hereto and marked as EXHIBIT-'A', which sets out in detail the grounds and procedure followed prior to termination of the plot allotment.</w:t>
       </w:r>
     </w:p>
     <w:p>
@@ -290,7 +292,7 @@
         <w:rPr>
           <w:sz w:val="24"/>
         </w:rPr>
-        <w:t>In the premises aforesaid, I say that the WRIT PETITION deserves to be dismissed with costs.</w:t>
+        <w:t>I say that in view of the foregoing, the Petitioner has failed to make out any case warranting interference by this Hon'ble Court under Article 226 of the Constitution of India, and the present Petition deserves to be dismissed with costs.</w:t>
       </w:r>
     </w:p>
     <w:p>
@@ -335,7 +337,7 @@
         <w:rPr>
           <w:sz w:val="24"/>
         </w:rPr>
-        <w:t>Dismiss the above Writ Petition with costs, and refuse any ad-interim or interim relief as prayed for by the Petitioner; and</w:t>
+        <w:t>dismiss the above Writ Petition with costs, and refuse to grant any ad-interim or interim relief restraining the Respondent Corporation from re-allotting the subject plot; and</w:t>
       </w:r>
     </w:p>
     <w:p>
@@ -350,26 +352,6 @@
           <w:sz w:val="24"/>
         </w:rPr>
         <w:t xml:space="preserve">(b) </w:t>
-      </w:r>
-      <w:r>
-        <w:rPr>
-          <w:sz w:val="24"/>
-        </w:rPr>
-        <w:t>refuse any interim or ad-interim relief sought by the Petitioner; and</w:t>
-      </w:r>
-    </w:p>
-    <w:p>
-      <w:pPr>
-        <w:spacing w:after="80"/>
-        <w:ind w:left="720"/>
-        <w:jc w:val="both"/>
-      </w:pPr>
-      <w:r>
-        <w:rPr>
-          <w:b/>
-          <w:sz w:val="24"/>
-        </w:rPr>
-        <w:t xml:space="preserve">(c) </w:t>
       </w:r>
       <w:r>
         <w:rPr>
@@ -400,7 +382,7 @@
         <w:rPr>
           <w:sz w:val="24"/>
         </w:rPr>
-        <w:t>On this 22nd day of October 2026</w:t>
+        <w:t>On this 14th day of October 2026</w:t>
       </w:r>
     </w:p>
     <w:p/>
@@ -451,7 +433,7 @@
         <w:rPr>
           <w:sz w:val="24"/>
         </w:rPr>
-        <w:t>I, Mrs. Kalpana Suresh Bhosale, the Deponent above named, do hereby verify that the contents of paragraphs 1 to 7 and the Prayer above are true and correct to my knowledge and belief and that nothing material has been concealed therefrom.</w:t>
+        <w:t>I, Mr. Suhas Balkrishna Kulkarni, the Deponent above named, do hereby verify that the contents of paragraphs 1 to 7 and the Prayer above are true and correct to my knowledge and belief and that nothing material has been concealed therefrom.</w:t>
       </w:r>
     </w:p>
     <w:p>
@@ -463,7 +445,7 @@
         <w:rPr>
           <w:sz w:val="24"/>
         </w:rPr>
-        <w:t>Verified at Mumbai on this 22nd day of October 2026.</w:t>
+        <w:t>Verified at Mumbai on this 14th day of October 2026.</w:t>
       </w:r>
     </w:p>
     <w:p/>
@@ -490,7 +472,7 @@
           <w:b/>
           <w:sz w:val="24"/>
         </w:rPr>
-        <w:t>KELKAR &amp; ASSOCIATES</w:t>
+        <w:t>KADAM &amp; PARTNERS</w:t>
       </w:r>
     </w:p>
     <w:p>
@@ -882,7 +864,7 @@
       <w:spacing w:after="120" w:line="276" w:lineRule="auto"/>
     </w:pPr>
     <w:rPr>
-      <w:rFonts w:ascii="Times New Roman" w:hAnsi="Times New Roman"/>
+      <w:rFonts w:ascii="Times New Roman" w:hAnsi="Times New Roman" w:cs="Times New Roman"/>
       <w:sz w:val="24"/>
     </w:rPr>
   </w:style>

</xml_diff>

<commit_message>
feat: multi-agent architecture with docx/pdf dual ingestion and evaluation checks
</commit_message>
<xml_diff>
--- a/backend/outputs/generated_affidavit.docx
+++ b/backend/outputs/generated_affidavit.docx
@@ -251,25 +251,6 @@
     </w:p>
     <w:p>
       <w:pPr>
-        <w:spacing w:after="160"/>
-        <w:jc w:val="both"/>
-      </w:pPr>
-      <w:r>
-        <w:rPr>
-          <w:b/>
-          <w:sz w:val="24"/>
-        </w:rPr>
-        <w:t xml:space="preserve">6. </w:t>
-      </w:r>
-      <w:r>
-        <w:rPr>
-          <w:sz w:val="24"/>
-        </w:rPr>
-        <w:t>Respondent No. 2 relies upon the communication dated 15 July 2026. A copy of that communication is to be annexed and marked as EXHIBIT-'A'.</w:t>
-      </w:r>
-    </w:p>
-    <w:p>
-      <w:pPr>
         <w:spacing w:before="240" w:after="120"/>
         <w:jc w:val="center"/>
       </w:pPr>
@@ -375,7 +356,7 @@
         <w:rPr>
           <w:sz w:val="24"/>
         </w:rPr>
-        <w:t>On this 5th day of September 2026</w:t>
+        <w:t>On this 12th day of September 2026</w:t>
       </w:r>
     </w:p>
     <w:p/>
@@ -426,7 +407,7 @@
         <w:rPr>
           <w:sz w:val="24"/>
         </w:rPr>
-        <w:t>I, Arvind Rajan, the Deponent above named, do hereby verify that the contents of paragraphs 1 to 6 and the Prayer above are true and correct to my knowledge and belief and that nothing material has been concealed therefrom.</w:t>
+        <w:t>I, Arvind Rajan, the Deponent above named, do hereby verify that the contents of paragraphs 1 to 5 and the Prayer above are true and correct to my knowledge and belief and that nothing material has been concealed therefrom.</w:t>
       </w:r>
     </w:p>
     <w:p>
@@ -438,7 +419,7 @@
         <w:rPr>
           <w:sz w:val="24"/>
         </w:rPr>
-        <w:t>Verified at Mumbai on this 5th day of September 2026.</w:t>
+        <w:t>Verified at Mumbai on this 12th day of September 2026.</w:t>
       </w:r>
     </w:p>
     <w:p/>
@@ -453,31 +434,6 @@
           <w:sz w:val="24"/>
         </w:rPr>
         <w:t>DEPONENT</w:t>
-      </w:r>
-    </w:p>
-    <w:p/>
-    <w:p>
-      <w:pPr>
-        <w:jc w:val="left"/>
-      </w:pPr>
-      <w:r>
-        <w:rPr>
-          <w:b/>
-          <w:sz w:val="24"/>
-        </w:rPr>
-        <w:t>RAJAN &amp; ASSOCIATES</w:t>
-      </w:r>
-    </w:p>
-    <w:p>
-      <w:pPr>
-        <w:spacing w:after="120"/>
-        <w:jc w:val="left"/>
-      </w:pPr>
-      <w:r>
-        <w:rPr>
-          <w:sz w:val="24"/>
-        </w:rPr>
-        <w:t>Advocates for the Respondent No.2.</w:t>
       </w:r>
     </w:p>
     <w:sectPr>

</xml_diff>